<commit_message>
Show professional documents and file analysis plans
Publish real redesigned Word/PDF/image samples, clearer responsive presentation, the five-trial-use file analysis add-on, its LINE purchase handoff and verified QR codes. Publish owner-confirmed seller identity and contact details, full checkout terms and manual invoice delivery disclosure. SMTP reminders require the separately pending owner setup.
</commit_message>
<xml_diff>
--- a/sample.docx
+++ b/sample.docx
@@ -5,20 +5,238 @@
     <w:p>
       <w:pPr>
         <w:pStyle w:val="Title"/>
-        <w:jc w:val="center"/>
+        <w:jc w:val="left"/>
       </w:pPr>
       <w:r>
         <w:t>幸福社區停水公告</w:t>
       </w:r>
     </w:p>
     <w:p>
+      <w:pPr>
+        <w:spacing w:after="400"/>
+      </w:pPr>
       <w:r>
-        <w:t>本社區將於2026年10月5日上午9時至中午12時停水，請全體住戶提前儲水備用。</w:t>
+        <w:rPr>
+          <w:color w:val="000000"/>
+          <w:sz w:val="22"/>
+        </w:rPr>
+        <w:t>供水設備維護通知</w:t>
+      </w:r>
+    </w:p>
+    <w:tbl>
+      <w:tblPr>
+        <w:tblW w:type="auto" w:w="0"/>
+        <w:tblLayout w:type="fixed"/>
+        <w:tblLook w:firstColumn="1" w:firstRow="1" w:lastColumn="0" w:lastRow="0" w:noHBand="0" w:noVBand="1" w:val="04A0"/>
+      </w:tblPr>
+      <w:tblGrid>
+        <w:gridCol w:w="1871"/>
+        <w:gridCol w:w="7087"/>
+      </w:tblGrid>
+      <w:tr>
+        <w:tc>
+          <w:tcPr>
+            <w:tcW w:type="dxa" w:w="1871"/>
+            <w:tcMar>
+              <w:top w:w="110" w:type="dxa"/>
+              <w:left w:w="110" w:type="dxa"/>
+              <w:bottom w:w="110" w:type="dxa"/>
+              <w:right w:w="110" w:type="dxa"/>
+            </w:tcMar>
+            <w:vAlign w:val="center"/>
+            <w:shd w:fill="EEEEEE"/>
+          </w:tcPr>
+          <w:p>
+            <w:pPr>
+              <w:spacing w:after="80" w:before="80" w:line="300" w:lineRule="auto"/>
+            </w:pPr>
+            <w:r>
+              <w:rPr>
+                <w:b/>
+                <w:sz w:val="21"/>
+              </w:rPr>
+              <w:t>停水時間</w:t>
+            </w:r>
+          </w:p>
+        </w:tc>
+        <w:tc>
+          <w:tcPr>
+            <w:tcW w:type="dxa" w:w="7087"/>
+            <w:tcMar>
+              <w:top w:w="110" w:type="dxa"/>
+              <w:left w:w="110" w:type="dxa"/>
+              <w:bottom w:w="110" w:type="dxa"/>
+              <w:right w:w="110" w:type="dxa"/>
+            </w:tcMar>
+            <w:vAlign w:val="center"/>
+            <w:shd w:fill="FAFAFA"/>
+          </w:tcPr>
+          <w:p>
+            <w:pPr>
+              <w:spacing w:after="80" w:before="80" w:line="300" w:lineRule="auto"/>
+            </w:pPr>
+            <w:r>
+              <w:rPr>
+                <w:b w:val="0"/>
+                <w:sz w:val="21"/>
+              </w:rPr>
+              <w:t>2026 年 10 月 5 日　09:00 至 12:00</w:t>
+            </w:r>
+          </w:p>
+        </w:tc>
+      </w:tr>
+      <w:tr>
+        <w:tc>
+          <w:tcPr>
+            <w:tcW w:type="dxa" w:w="1871"/>
+            <w:tcMar>
+              <w:top w:w="110" w:type="dxa"/>
+              <w:left w:w="110" w:type="dxa"/>
+              <w:bottom w:w="110" w:type="dxa"/>
+              <w:right w:w="110" w:type="dxa"/>
+            </w:tcMar>
+            <w:vAlign w:val="center"/>
+            <w:shd w:fill="EEEEEE"/>
+          </w:tcPr>
+          <w:p>
+            <w:pPr>
+              <w:spacing w:after="80" w:before="80" w:line="300" w:lineRule="auto"/>
+            </w:pPr>
+            <w:r>
+              <w:rPr>
+                <w:b/>
+                <w:sz w:val="21"/>
+              </w:rPr>
+              <w:t>影響範圍</w:t>
+            </w:r>
+          </w:p>
+        </w:tc>
+        <w:tc>
+          <w:tcPr>
+            <w:tcW w:type="dxa" w:w="7087"/>
+            <w:tcMar>
+              <w:top w:w="110" w:type="dxa"/>
+              <w:left w:w="110" w:type="dxa"/>
+              <w:bottom w:w="110" w:type="dxa"/>
+              <w:right w:w="110" w:type="dxa"/>
+            </w:tcMar>
+            <w:vAlign w:val="center"/>
+            <w:shd w:fill="FAFAFA"/>
+          </w:tcPr>
+          <w:p>
+            <w:pPr>
+              <w:spacing w:after="80" w:before="80" w:line="300" w:lineRule="auto"/>
+            </w:pPr>
+            <w:r>
+              <w:rPr>
+                <w:b w:val="0"/>
+                <w:sz w:val="21"/>
+              </w:rPr>
+              <w:t>幸福社區全體住戶及公共區域</w:t>
+            </w:r>
+          </w:p>
+        </w:tc>
+      </w:tr>
+      <w:tr>
+        <w:tc>
+          <w:tcPr>
+            <w:tcW w:type="dxa" w:w="1871"/>
+            <w:tcMar>
+              <w:top w:w="110" w:type="dxa"/>
+              <w:left w:w="110" w:type="dxa"/>
+              <w:bottom w:w="110" w:type="dxa"/>
+              <w:right w:w="110" w:type="dxa"/>
+            </w:tcMar>
+            <w:vAlign w:val="center"/>
+            <w:shd w:fill="EEEEEE"/>
+          </w:tcPr>
+          <w:p>
+            <w:pPr>
+              <w:spacing w:after="80" w:before="80" w:line="300" w:lineRule="auto"/>
+            </w:pPr>
+            <w:r>
+              <w:rPr>
+                <w:b/>
+                <w:sz w:val="21"/>
+              </w:rPr>
+              <w:t>洽詢窗口</w:t>
+            </w:r>
+          </w:p>
+        </w:tc>
+        <w:tc>
+          <w:tcPr>
+            <w:tcW w:type="dxa" w:w="7087"/>
+            <w:tcMar>
+              <w:top w:w="110" w:type="dxa"/>
+              <w:left w:w="110" w:type="dxa"/>
+              <w:bottom w:w="110" w:type="dxa"/>
+              <w:right w:w="110" w:type="dxa"/>
+            </w:tcMar>
+            <w:vAlign w:val="center"/>
+            <w:shd w:fill="FAFAFA"/>
+          </w:tcPr>
+          <w:p>
+            <w:pPr>
+              <w:spacing w:after="80" w:before="80" w:line="300" w:lineRule="auto"/>
+            </w:pPr>
+            <w:r>
+              <w:rPr>
+                <w:b w:val="0"/>
+                <w:sz w:val="21"/>
+              </w:rPr>
+              <w:t>社區管理室　分機【待填】</w:t>
+            </w:r>
+          </w:p>
+        </w:tc>
+      </w:tr>
+    </w:tbl>
+    <w:p>
+      <w:pPr>
+        <w:spacing w:after="40"/>
+      </w:pPr>
+    </w:p>
+    <w:p>
+      <w:r>
+        <w:t>各位住戶您好：為辦理社區供水設備維護，將於上述時段暫停供水。請提前準備生活用水，並配合下列事項。</w:t>
+      </w:r>
+    </w:p>
+    <w:p>
+      <w:pPr>
+        <w:pStyle w:val="Heading1"/>
+      </w:pPr>
+      <w:r>
+        <w:t>停水前請先準備</w:t>
+      </w:r>
+    </w:p>
+    <w:p>
+      <w:pPr>
+        <w:pStyle w:val="ListBullet"/>
+        <w:spacing w:after="120"/>
+      </w:pPr>
+      <w:r>
+        <w:t>依家庭需要預先儲水，飲用水與清潔用水分開保存。</w:t>
+      </w:r>
+    </w:p>
+    <w:p>
+      <w:pPr>
+        <w:pStyle w:val="ListBullet"/>
+        <w:spacing w:after="120"/>
+      </w:pPr>
+      <w:r>
+        <w:t>調整洗衣、清潔等用水安排，並確認水龍頭已關閉。</w:t>
+      </w:r>
+    </w:p>
+    <w:p>
+      <w:pPr>
+        <w:pStyle w:val="Heading1"/>
+      </w:pPr>
+      <w:r>
+        <w:t>供水恢復與後續通知</w:t>
       </w:r>
     </w:p>
     <w:p>
       <w:r>
-        <w:t>請住戶於停水前完成用水準備，並於停水期間配合節約使用現有儲水，以維持生活所需。</w:t>
+        <w:t>預計於中午 12 時恢復供水。若維護時程調整，管理室將另行通知；需要協助的住戶，請洽管理室確認。</w:t>
       </w:r>
     </w:p>
     <w:p>
@@ -38,7 +256,7 @@
         <w:jc w:val="right"/>
       </w:pPr>
       <w:r>
-        <w:t>2026年9月24日</w:t>
+        <w:t>2026 年 9 月 25 日</w:t>
       </w:r>
     </w:p>
     <w:sectPr>
@@ -441,12 +659,12 @@
     <w:rsid w:val="00FC693F"/>
     <w:pPr>
       <w:widowControl/>
-      <w:spacing w:line="372" w:lineRule="auto" w:after="200"/>
+      <w:spacing w:line="336" w:lineRule="auto" w:after="180"/>
     </w:pPr>
     <w:rPr>
       <w:rFonts w:ascii="Microsoft JhengHei" w:hAnsi="Microsoft JhengHei" w:eastAsia="Microsoft JhengHei"/>
       <w:color w:val="000000"/>
-      <w:sz w:val="24"/>
+      <w:sz w:val="23"/>
     </w:rPr>
   </w:style>
   <w:style w:type="paragraph" w:styleId="Header">
@@ -504,7 +722,7 @@
     <w:pPr>
       <w:keepNext/>
       <w:keepLines/>
-      <w:spacing w:before="480" w:after="0"/>
+      <w:spacing w:before="360" w:after="180"/>
       <w:outlineLvl w:val="0"/>
     </w:pPr>
     <w:rPr>
@@ -512,7 +730,7 @@
       <w:b/>
       <w:bCs/>
       <w:color w:val="000000"/>
-      <w:sz w:val="28"/>
+      <w:sz w:val="30"/>
       <w:szCs w:val="28"/>
     </w:rPr>
   </w:style>
@@ -528,7 +746,7 @@
     <w:pPr>
       <w:keepNext/>
       <w:keepLines/>
-      <w:spacing w:before="200" w:after="0"/>
+      <w:spacing w:before="360" w:after="180"/>
       <w:outlineLvl w:val="1"/>
     </w:pPr>
     <w:rPr>
@@ -536,7 +754,7 @@
       <w:b/>
       <w:bCs/>
       <w:color w:val="000000"/>
-      <w:sz w:val="26"/>
+      <w:sz w:val="24"/>
       <w:szCs w:val="26"/>
     </w:rPr>
   </w:style>
@@ -791,7 +1009,7 @@
     <w:rsid w:val="00FC693F"/>
     <w:pPr>
       <w:keepNext/>
-      <w:spacing w:after="480" w:line="240" w:lineRule="auto"/>
+      <w:spacing w:after="240" w:line="240" w:lineRule="auto" w:before="0"/>
       <w:contextualSpacing/>
     </w:pPr>
     <w:rPr>
@@ -800,7 +1018,7 @@
       <w:color w:val="000000"/>
       <w:spacing w:val="5"/>
       <w:kern w:val="28"/>
-      <w:sz w:val="44"/>
+      <w:sz w:val="50"/>
       <w:szCs w:val="52"/>
     </w:rPr>
   </w:style>
@@ -976,6 +1194,10 @@
       </w:numPr>
       <w:contextualSpacing/>
     </w:pPr>
+    <w:rPr>
+      <w:rFonts w:ascii="Microsoft JhengHei" w:hAnsi="Microsoft JhengHei" w:eastAsia="Microsoft JhengHei"/>
+      <w:color w:val="000000"/>
+    </w:rPr>
   </w:style>
   <w:style w:type="paragraph" w:styleId="ListBullet2">
     <w:name w:val="List Bullet 2"/>

</xml_diff>